<commit_message>
Update one-page resume (docx/pdf/draft)
Co-Authored-By: Claude Opus 4.8 <noreply@anthropic.com>
</commit_message>
<xml_diff>
--- a/career/resume/MichaelRao_2026_Resume_OnePage.docx
+++ b/career/resume/MichaelRao_2026_Resume_OnePage.docx
@@ -55,7 +55,7 @@
           <w:b w:val="0"/>
           <w:i w:val="0"/>
         </w:rPr>
-        <w:t>Senior full-stack developer and squad lead with 9+ years in financial technology at Morgan Stanley, currently leading a Snowflake-based fee-revenue and financial reporting platform for Wealth Management leadership and the CFO organization. Track record of building five financial platforms end-to-end from the ground up — each migrating data off an external system and tied to a regulatory deadline or acquisition — spanning financial data, compliance controls, and cross-functional delivery.</w:t>
+        <w:t>Senior full-stack developer and squad lead with 9+ years in financial technology at Morgan Stanley, currently leading a Snowflake fee-revenue and financial reporting platform for Wealth Management leadership and the CFO organization. Has delivered five financial platforms end-to-end, each replacing an external system against a regulatory or acquisition deadline. Depth across financial data, compliance controls, and cross-functional delivery.</w:t>
       </w:r>
     </w:p>
     <w:p>
@@ -238,7 +238,7 @@
           <w:b w:val="0"/>
           <w:i w:val="0"/>
         </w:rPr>
-        <w:t>Leading architecture of a Snowflake cloud data platform delivering advisory fee revenue, AUM, and ROA reporting across ~$3 trillion in client assets to Wealth Management leadership and the WM CFO organization — replacing manual, Excel-driven EUC processes with reporting at scale</w:t>
+        <w:t>Own the architecture of a Snowflake platform delivering advisory fee, AUM, and ROA reporting across ~$3 trillion in client assets to WM leadership and the CFO organization, retiring manual Excel-driven EUC processes</w:t>
       </w:r>
     </w:p>
     <w:p>
@@ -254,7 +254,7 @@
           <w:b w:val="0"/>
           <w:i w:val="0"/>
         </w:rPr>
-        <w:t>Building a ReactJS and FastAPI application featuring a Snowflake Cortex Agent chat that lets users query fee, AUM, and ROA data conversationally, powered by Semantic Views, Skills, and Dynamic Tables</w:t>
+        <w:t>Building a ReactJS/FastAPI application with a Snowflake Cortex Agent chat that lets users query fee, AUM, and ROA data in natural language — powered by Semantic Views, Skills, and Dynamic Tables</w:t>
       </w:r>
     </w:p>
     <w:p>
@@ -405,6 +405,47 @@
           <w:color w:val="1A1A1A"/>
           <w:sz w:val="23"/>
         </w:rPr>
+        <w:t>Career Break</w:t>
+      </w:r>
+      <w:r>
+        <w:tab/>
+      </w:r>
+      <w:r>
+        <w:rPr>
+          <w:i/>
+          <w:color w:val="444444"/>
+          <w:sz w:val="19"/>
+        </w:rPr>
+        <w:t>Mar 2022 – Apr 2023</w:t>
+      </w:r>
+    </w:p>
+    <w:p>
+      <w:pPr>
+        <w:spacing w:before="0" w:after="20" w:line="240" w:lineRule="auto"/>
+      </w:pPr>
+      <w:r>
+        <w:rPr>
+          <w:b w:val="0"/>
+          <w:i w:val="0"/>
+          <w:color w:val="1A1A1A"/>
+          <w:sz w:val="20"/>
+        </w:rPr>
+        <w:t>Planned time off — self-directed study and open-source development, leading into Progressive Overflow</w:t>
+      </w:r>
+    </w:p>
+    <w:p>
+      <w:pPr>
+        <w:tabs>
+          <w:tab w:pos="10512" w:val="right"/>
+        </w:tabs>
+        <w:spacing w:before="120" w:after="0" w:line="240" w:lineRule="auto"/>
+      </w:pPr>
+      <w:r>
+        <w:rPr>
+          <w:b/>
+          <w:color w:val="1A1A1A"/>
+          <w:sz w:val="23"/>
+        </w:rPr>
         <w:t>Morgan Stanley</w:t>
       </w:r>
       <w:r>
@@ -453,7 +494,7 @@
           <w:b w:val="0"/>
           <w:i w:val="0"/>
         </w:rPr>
-        <w:t>Led GL decommissioning across three acquisitions — E*TRADE ($13B), Eaton Vance ($7B), Shareworks (~$900M) — engineering automated journal-ingestion pipelines in Teradata, Shell, and Python orchestrated via Autosys and an in-house ETL framework, plus a C# .NET WPF migration tool with audited correction and approval-gated posting</w:t>
+        <w:t>Led GL decommissioning across three acquisitions — E*TRADE ($13B), Eaton Vance ($7B), Shareworks (~$900M) — building automated journal-ingestion pipelines in Teradata, Shell, and Python via Autosys and an in-house ETL framework, plus a C# .NET WPF migration tool with audited, approval-gated posting</w:t>
       </w:r>
     </w:p>
     <w:p>
@@ -515,7 +556,7 @@
           <w:b w:val="0"/>
           <w:i w:val="0"/>
         </w:rPr>
-        <w:t>Drove trunk-based development and CI/CD adoption across the team, reducing integration overhead and enabling frequent, stable releases with direct client feedback loops</w:t>
+        <w:t>Drove trunk-based development and CI/CD adoption across the team, enabling frequent, stable releases</w:t>
       </w:r>
     </w:p>
     <w:p>

</xml_diff>